<commit_message>
better mobile design; pdf CV;
</commit_message>
<xml_diff>
--- a/public/CVTemplateFull.docx
+++ b/public/CVTemplateFull.docx
@@ -6,14 +6,14 @@
       <w:pPr>
         <w:ind w:left="0" w:leftChars="0" w:firstLine="0" w:firstLineChars="0"/>
         <w:rPr>
-          <w:rFonts w:hint="default"/>
+          <w:rFonts w:hint="default" w:asciiTheme="minorAscii" w:hAnsiTheme="minorAscii"/>
           <w:vertAlign w:val="baseline"/>
           <w:lang w:val="en-US"/>
         </w:rPr>
       </w:pPr>
       <w:r>
         <w:rPr>
-          <w:rFonts w:hint="default"/>
+          <w:rFonts w:hint="default" w:asciiTheme="minorAscii" w:hAnsiTheme="minorAscii"/>
           <w:vertAlign w:val="baseline"/>
           <w:lang w:val="en-US"/>
         </w:rPr>
@@ -70,7 +70,7 @@
       <w:pPr>
         <w:ind w:left="0" w:leftChars="0" w:firstLine="0" w:firstLineChars="0"/>
         <w:rPr>
-          <w:rFonts w:hint="default"/>
+          <w:rFonts w:hint="default" w:asciiTheme="minorAscii" w:hAnsiTheme="minorAscii"/>
           <w:sz w:val="28"/>
           <w:szCs w:val="28"/>
           <w:vertAlign w:val="baseline"/>
@@ -82,7 +82,7 @@
       <w:pPr>
         <w:ind w:left="0" w:leftChars="0" w:firstLine="0" w:firstLineChars="0"/>
         <w:rPr>
-          <w:rFonts w:hint="default"/>
+          <w:rFonts w:hint="default" w:asciiTheme="minorAscii" w:hAnsiTheme="minorAscii"/>
           <w:sz w:val="28"/>
           <w:szCs w:val="28"/>
           <w:vertAlign w:val="baseline"/>
@@ -91,7 +91,7 @@
       </w:pPr>
       <w:r>
         <w:rPr>
-          <w:rFonts w:hint="default"/>
+          <w:rFonts w:hint="default" w:asciiTheme="minorAscii" w:hAnsiTheme="minorAscii"/>
           <w:sz w:val="28"/>
           <w:szCs w:val="28"/>
           <w:vertAlign w:val="baseline"/>
@@ -119,7 +119,7 @@
         <w:ind w:left="0" w:leftChars="0" w:firstLine="0" w:firstLineChars="0"/>
         <w:textAlignment w:val="auto"/>
         <w:rPr>
-          <w:rFonts w:hint="default" w:ascii="Amiri" w:hAnsi="Amiri" w:cs="Amiri"/>
+          <w:rFonts w:hint="default" w:cs="Amiri" w:asciiTheme="minorAscii" w:hAnsiTheme="minorAscii"/>
           <w:sz w:val="21"/>
           <w:szCs w:val="21"/>
           <w:vertAlign w:val="baseline"/>
@@ -128,7 +128,7 @@
       </w:pPr>
       <w:r>
         <w:rPr>
-          <w:rFonts w:hint="default" w:ascii="Amiri" w:hAnsi="Amiri" w:cs="Amiri"/>
+          <w:rFonts w:hint="default" w:cs="Amiri" w:asciiTheme="minorAscii" w:hAnsiTheme="minorAscii"/>
           <w:sz w:val="21"/>
           <w:szCs w:val="21"/>
           <w:vertAlign w:val="baseline"/>
@@ -140,7 +140,7 @@
     <w:p>
       <w:pPr>
         <w:rPr>
-          <w:rFonts w:hint="default"/>
+          <w:rFonts w:hint="default" w:asciiTheme="minorAscii" w:hAnsiTheme="minorAscii"/>
           <w:u w:val="single"/>
           <w:vertAlign w:val="baseline"/>
           <w:lang w:val="en-US"/>
@@ -150,7 +150,7 @@
     <w:p>
       <w:pPr>
         <w:rPr>
-          <w:rFonts w:hint="default"/>
+          <w:rFonts w:hint="default" w:asciiTheme="minorAscii" w:hAnsiTheme="minorAscii"/>
           <w:u w:val="single"/>
           <w:vertAlign w:val="baseline"/>
           <w:lang w:val="en-US"/>
@@ -160,7 +160,7 @@
     <w:p>
       <w:pPr>
         <w:rPr>
-          <w:rFonts w:hint="default"/>
+          <w:rFonts w:hint="default" w:asciiTheme="minorAscii" w:hAnsiTheme="minorAscii"/>
           <w:b/>
           <w:bCs/>
           <w:u w:val="none"/>
@@ -170,7 +170,7 @@
       </w:pPr>
       <w:r>
         <w:rPr>
-          <w:rFonts w:hint="default"/>
+          <w:rFonts w:hint="default" w:asciiTheme="minorAscii" w:hAnsiTheme="minorAscii"/>
           <w:b/>
           <w:bCs/>
           <w:u w:val="none"/>
@@ -183,7 +183,7 @@
     <w:p>
       <w:pPr>
         <w:rPr>
-          <w:rFonts w:hint="default"/>
+          <w:rFonts w:hint="default" w:asciiTheme="minorAscii" w:hAnsiTheme="minorAscii"/>
           <w:u w:val="none"/>
           <w:vertAlign w:val="baseline"/>
           <w:lang w:val="en-US"/>
@@ -191,6 +191,7 @@
       </w:pPr>
       <w:r>
         <w:rPr>
+          <w:rFonts w:hint="default" w:asciiTheme="minorAscii" w:hAnsiTheme="minorAscii"/>
           <w:sz w:val="20"/>
         </w:rPr>
         <mc:AlternateContent>
@@ -265,7 +266,7 @@
         <w:ind w:left="400" w:leftChars="200" w:firstLine="0" w:firstLineChars="0"/>
         <w:jc w:val="left"/>
         <w:rPr>
-          <w:rFonts w:hint="default" w:ascii="Amiri" w:hAnsi="Amiri" w:eastAsia="SimSun" w:cs="Amiri"/>
+          <w:rFonts w:hint="default" w:eastAsia="SimSun" w:cs="Amiri" w:asciiTheme="minorAscii" w:hAnsiTheme="minorAscii"/>
           <w:kern w:val="0"/>
           <w:sz w:val="24"/>
           <w:szCs w:val="24"/>
@@ -274,7 +275,7 @@
       </w:pPr>
       <w:r>
         <w:rPr>
-          <w:rFonts w:ascii="SimSun" w:hAnsi="SimSun" w:eastAsia="SimSun" w:cs="SimSun"/>
+          <w:rFonts w:hint="default" w:eastAsia="SimSun" w:cs="SimSun" w:asciiTheme="minorAscii" w:hAnsiTheme="minorAscii"/>
           <w:kern w:val="0"/>
           <w:sz w:val="24"/>
           <w:szCs w:val="24"/>
@@ -332,7 +333,7 @@
       </w:r>
       <w:r>
         <w:rPr>
-          <w:rFonts w:hint="default" w:ascii="Amiri" w:hAnsi="Amiri" w:eastAsia="SimSun" w:cs="Amiri"/>
+          <w:rFonts w:hint="default" w:eastAsia="SimSun" w:cs="Amiri" w:asciiTheme="minorAscii" w:hAnsiTheme="minorAscii"/>
           <w:kern w:val="0"/>
           <w:sz w:val="24"/>
           <w:szCs w:val="24"/>
@@ -350,7 +351,7 @@
         <w:ind w:left="400" w:leftChars="200" w:firstLine="0" w:firstLineChars="0"/>
         <w:jc w:val="left"/>
         <w:rPr>
-          <w:rFonts w:hint="default" w:ascii="Amiri" w:hAnsi="Amiri" w:cs="Amiri"/>
+          <w:rFonts w:hint="default" w:cs="Amiri" w:asciiTheme="minorAscii" w:hAnsiTheme="minorAscii"/>
           <w:sz w:val="24"/>
           <w:szCs w:val="24"/>
           <w:lang w:val="en-US"/>
@@ -358,7 +359,7 @@
       </w:pPr>
       <w:r>
         <w:rPr>
-          <w:rFonts w:hint="default" w:ascii="Amiri" w:hAnsi="Amiri" w:eastAsia="SimSun" w:cs="Amiri"/>
+          <w:rFonts w:hint="default" w:eastAsia="SimSun" w:cs="Amiri" w:asciiTheme="minorAscii" w:hAnsiTheme="minorAscii"/>
           <w:kern w:val="0"/>
           <w:sz w:val="24"/>
           <w:szCs w:val="24"/>
@@ -416,7 +417,7 @@
       </w:r>
       <w:r>
         <w:rPr>
-          <w:rFonts w:hint="default" w:ascii="Amiri" w:hAnsi="Amiri" w:eastAsia="SimSun" w:cs="Amiri"/>
+          <w:rFonts w:hint="default" w:eastAsia="SimSun" w:cs="Amiri" w:asciiTheme="minorAscii" w:hAnsiTheme="minorAscii"/>
           <w:kern w:val="0"/>
           <w:sz w:val="24"/>
           <w:szCs w:val="24"/>
@@ -434,7 +435,7 @@
         <w:ind w:left="400" w:leftChars="200" w:firstLine="0" w:firstLineChars="0"/>
         <w:jc w:val="left"/>
         <w:rPr>
-          <w:rFonts w:hint="default" w:ascii="Amiri" w:hAnsi="Amiri" w:eastAsia="SimSun" w:cs="Amiri"/>
+          <w:rFonts w:hint="default" w:eastAsia="SimSun" w:cs="Amiri" w:asciiTheme="minorAscii" w:hAnsiTheme="minorAscii"/>
           <w:kern w:val="0"/>
           <w:sz w:val="24"/>
           <w:szCs w:val="24"/>
@@ -443,7 +444,7 @@
       </w:pPr>
       <w:r>
         <w:rPr>
-          <w:rFonts w:hint="default" w:ascii="Amiri" w:hAnsi="Amiri" w:cs="Amiri"/>
+          <w:rFonts w:hint="default" w:cs="Amiri" w:asciiTheme="minorAscii" w:hAnsiTheme="minorAscii"/>
           <w:b w:val="0"/>
           <w:bCs w:val="0"/>
           <w:color w:val="595959" w:themeColor="text1" w:themeTint="A6"/>
@@ -510,7 +511,7 @@
       </w:r>
       <w:r>
         <w:rPr>
-          <w:rFonts w:ascii="SimSun" w:hAnsi="SimSun" w:eastAsia="SimSun" w:cs="SimSun"/>
+          <w:rFonts w:hint="default" w:eastAsia="SimSun" w:cs="SimSun" w:asciiTheme="minorAscii" w:hAnsiTheme="minorAscii"/>
           <w:kern w:val="0"/>
           <w:sz w:val="24"/>
           <w:szCs w:val="24"/>
@@ -568,7 +569,7 @@
       </w:r>
       <w:r>
         <w:rPr>
-          <w:rFonts w:hint="default" w:ascii="Amiri" w:hAnsi="Amiri" w:eastAsia="SimSun" w:cs="Amiri"/>
+          <w:rFonts w:hint="default" w:eastAsia="SimSun" w:cs="Amiri" w:asciiTheme="minorAscii" w:hAnsiTheme="minorAscii"/>
           <w:kern w:val="0"/>
           <w:sz w:val="24"/>
           <w:szCs w:val="24"/>
@@ -586,7 +587,7 @@
         <w:ind w:left="400" w:leftChars="200" w:firstLine="0" w:firstLineChars="0"/>
         <w:jc w:val="left"/>
         <w:rPr>
-          <w:rFonts w:hint="default" w:ascii="Amiri" w:hAnsi="Amiri" w:eastAsia="SimSun" w:cs="Amiri"/>
+          <w:rFonts w:hint="default" w:eastAsia="SimSun" w:cs="Amiri" w:asciiTheme="minorAscii" w:hAnsiTheme="minorAscii"/>
           <w:kern w:val="0"/>
           <w:sz w:val="24"/>
           <w:szCs w:val="24"/>
@@ -595,7 +596,7 @@
       </w:pPr>
       <w:r>
         <w:rPr>
-          <w:rFonts w:hint="default" w:ascii="Amiri" w:hAnsi="Amiri" w:eastAsia="SimSun" w:cs="Amiri"/>
+          <w:rFonts w:hint="default" w:eastAsia="SimSun" w:cs="Amiri" w:asciiTheme="minorAscii" w:hAnsiTheme="minorAscii"/>
           <w:kern w:val="0"/>
           <w:sz w:val="24"/>
           <w:szCs w:val="24"/>
@@ -604,12 +605,24 @@
         <w:t>hackerrank.com/walid_khial</w:t>
       </w:r>
     </w:p>
-    <w:p/>
-    <w:p/>
-    <w:p>
-      <w:pPr>
-        <w:rPr>
-          <w:rFonts w:hint="default"/>
+    <w:p>
+      <w:pPr>
+        <w:rPr>
+          <w:rFonts w:hint="default" w:asciiTheme="minorAscii" w:hAnsiTheme="minorAscii"/>
+        </w:rPr>
+      </w:pPr>
+    </w:p>
+    <w:p>
+      <w:pPr>
+        <w:rPr>
+          <w:rFonts w:hint="default" w:asciiTheme="minorAscii" w:hAnsiTheme="minorAscii"/>
+        </w:rPr>
+      </w:pPr>
+    </w:p>
+    <w:p>
+      <w:pPr>
+        <w:rPr>
+          <w:rFonts w:hint="default" w:asciiTheme="minorAscii" w:hAnsiTheme="minorAscii"/>
           <w:b/>
           <w:bCs/>
           <w:u w:val="none"/>
@@ -619,7 +632,7 @@
       </w:pPr>
       <w:r>
         <w:rPr>
-          <w:rFonts w:hint="default"/>
+          <w:rFonts w:hint="default" w:asciiTheme="minorAscii" w:hAnsiTheme="minorAscii"/>
           <w:b/>
           <w:bCs/>
           <w:sz w:val="22"/>
@@ -632,7 +645,7 @@
       </w:r>
       <w:r>
         <w:rPr>
-          <w:rFonts w:hint="default"/>
+          <w:rFonts w:hint="default" w:asciiTheme="minorAscii" w:hAnsiTheme="minorAscii"/>
           <w:b/>
           <w:bCs/>
           <w:u w:val="none"/>
@@ -645,7 +658,7 @@
     <w:p>
       <w:pPr>
         <w:rPr>
-          <w:rFonts w:hint="default"/>
+          <w:rFonts w:hint="default" w:asciiTheme="minorAscii" w:hAnsiTheme="minorAscii"/>
           <w:u w:val="none"/>
           <w:vertAlign w:val="baseline"/>
           <w:lang w:val="en-US"/>
@@ -653,6 +666,7 @@
       </w:pPr>
       <w:r>
         <w:rPr>
+          <w:rFonts w:hint="default" w:asciiTheme="minorAscii" w:hAnsiTheme="minorAscii"/>
           <w:sz w:val="20"/>
         </w:rPr>
         <mc:AlternateContent>
@@ -723,7 +737,7 @@
         <w:widowControl w:val="0"/>
         <w:jc w:val="both"/>
         <w:rPr>
-          <w:rFonts w:hint="default" w:ascii="Amiri" w:hAnsi="Amiri" w:cs="Amiri"/>
+          <w:rFonts w:hint="default" w:cs="Amiri" w:asciiTheme="minorAscii" w:hAnsiTheme="minorAscii"/>
           <w:b w:val="0"/>
           <w:bCs w:val="0"/>
           <w:color w:val="595959" w:themeColor="text1" w:themeTint="A6"/>
@@ -743,7 +757,7 @@
       </w:pPr>
       <w:r>
         <w:rPr>
-          <w:rFonts w:hint="default" w:ascii="Amiri" w:hAnsi="Amiri" w:cs="Amiri"/>
+          <w:rFonts w:hint="default" w:cs="Amiri" w:asciiTheme="minorAscii" w:hAnsiTheme="minorAscii"/>
           <w:sz w:val="22"/>
           <w:szCs w:val="22"/>
           <w:vertAlign w:val="baseline"/>
@@ -753,7 +767,7 @@
       </w:r>
       <w:r>
         <w:rPr>
-          <w:rFonts w:hint="default" w:ascii="Amiri" w:hAnsi="Amiri" w:cs="Amiri"/>
+          <w:rFonts w:hint="default" w:cs="Amiri" w:asciiTheme="minorAscii" w:hAnsiTheme="minorAscii"/>
           <w:b w:val="0"/>
           <w:bCs w:val="0"/>
           <w:color w:val="595959" w:themeColor="text1" w:themeTint="A6"/>
@@ -778,7 +792,7 @@
         <w:widowControl w:val="0"/>
         <w:jc w:val="both"/>
         <w:rPr>
-          <w:rFonts w:hint="default" w:ascii="Amiri" w:hAnsi="Amiri" w:cs="Amiri"/>
+          <w:rFonts w:hint="default" w:cs="Amiri" w:asciiTheme="minorAscii" w:hAnsiTheme="minorAscii"/>
           <w:sz w:val="22"/>
           <w:szCs w:val="22"/>
           <w:vertAlign w:val="baseline"/>
@@ -787,7 +801,7 @@
       </w:pPr>
       <w:r>
         <w:rPr>
-          <w:rFonts w:hint="default" w:ascii="Amiri" w:hAnsi="Amiri" w:cs="Amiri"/>
+          <w:rFonts w:hint="default" w:cs="Amiri" w:asciiTheme="minorAscii" w:hAnsiTheme="minorAscii"/>
           <w:sz w:val="22"/>
           <w:szCs w:val="22"/>
           <w:vertAlign w:val="baseline"/>
@@ -801,7 +815,7 @@
         <w:widowControl w:val="0"/>
         <w:jc w:val="both"/>
         <w:rPr>
-          <w:rFonts w:hint="default" w:ascii="Amiri" w:hAnsi="Amiri" w:cs="Amiri"/>
+          <w:rFonts w:hint="default" w:cs="Amiri" w:asciiTheme="minorAscii" w:hAnsiTheme="minorAscii"/>
           <w:sz w:val="22"/>
           <w:szCs w:val="22"/>
           <w:vertAlign w:val="baseline"/>
@@ -809,11 +823,17 @@
         </w:rPr>
       </w:pPr>
     </w:p>
-    <w:p/>
-    <w:p>
-      <w:pPr>
-        <w:rPr>
-          <w:rFonts w:hint="default"/>
+    <w:p>
+      <w:pPr>
+        <w:rPr>
+          <w:rFonts w:hint="default" w:asciiTheme="minorAscii" w:hAnsiTheme="minorAscii"/>
+        </w:rPr>
+      </w:pPr>
+    </w:p>
+    <w:p>
+      <w:pPr>
+        <w:rPr>
+          <w:rFonts w:hint="default" w:asciiTheme="minorAscii" w:hAnsiTheme="minorAscii"/>
           <w:b/>
           <w:bCs/>
           <w:sz w:val="22"/>
@@ -825,7 +845,7 @@
       </w:pPr>
       <w:r>
         <w:rPr>
-          <w:rFonts w:hint="default"/>
+          <w:rFonts w:hint="default" w:asciiTheme="minorAscii" w:hAnsiTheme="minorAscii"/>
           <w:b/>
           <w:bCs/>
           <w:sz w:val="22"/>
@@ -838,8 +858,14 @@
       </w:r>
     </w:p>
     <w:p>
-      <w:r>
-        <w:rPr>
+      <w:pPr>
+        <w:rPr>
+          <w:rFonts w:hint="default" w:asciiTheme="minorAscii" w:hAnsiTheme="minorAscii"/>
+        </w:rPr>
+      </w:pPr>
+      <w:r>
+        <w:rPr>
+          <w:rFonts w:hint="default" w:asciiTheme="minorAscii" w:hAnsiTheme="minorAscii"/>
           <w:sz w:val="20"/>
         </w:rPr>
         <mc:AlternateContent>
@@ -923,6 +949,9 @@
         <w:spacing w:line="10" w:lineRule="atLeast"/>
         <w:jc w:val="both"/>
         <w:textAlignment w:val="auto"/>
+        <w:rPr>
+          <w:rFonts w:hint="default" w:asciiTheme="minorAscii" w:hAnsiTheme="minorAscii"/>
+        </w:rPr>
       </w:pPr>
     </w:p>
     <w:p>
@@ -944,14 +973,14 @@
         <w:jc w:val="both"/>
         <w:textAlignment w:val="auto"/>
         <w:rPr>
-          <w:rFonts w:hint="default" w:ascii="Amiri" w:hAnsi="Amiri" w:cs="Amiri"/>
-          <w:sz w:val="20"/>
-          <w:lang w:val="en-US"/>
-        </w:rPr>
-      </w:pPr>
-      <w:r>
-        <w:rPr>
-          <w:rFonts w:hint="default" w:ascii="Amiri" w:hAnsi="Amiri" w:cs="Amiri"/>
+          <w:rFonts w:hint="default" w:cs="Amiri" w:asciiTheme="minorAscii" w:hAnsiTheme="minorAscii"/>
+          <w:sz w:val="20"/>
+          <w:lang w:val="en-US"/>
+        </w:rPr>
+      </w:pPr>
+      <w:r>
+        <w:rPr>
+          <w:rFonts w:hint="default" w:cs="Amiri" w:asciiTheme="minorAscii" w:hAnsiTheme="minorAscii"/>
           <w:sz w:val="20"/>
           <w:lang w:val="en-US"/>
         </w:rPr>
@@ -977,18 +1006,26 @@
         <w:jc w:val="both"/>
         <w:textAlignment w:val="auto"/>
         <w:rPr>
-          <w:rFonts w:hint="default" w:ascii="Amiri" w:hAnsi="Amiri" w:cs="Amiri"/>
-          <w:sz w:val="20"/>
-          <w:lang w:val="en-US"/>
-        </w:rPr>
-      </w:pPr>
-      <w:r>
-        <w:rPr>
-          <w:rFonts w:hint="default" w:ascii="Amiri" w:hAnsi="Amiri" w:cs="Amiri"/>
+          <w:rFonts w:hint="default" w:asciiTheme="minorAscii" w:hAnsiTheme="minorAscii"/>
+          <w:sz w:val="20"/>
+          <w:lang w:val="en-US"/>
+        </w:rPr>
+      </w:pPr>
+      <w:r>
+        <w:rPr>
+          <w:rFonts w:hint="default" w:cs="Amiri" w:asciiTheme="minorAscii" w:hAnsiTheme="minorAscii"/>
           <w:sz w:val="20"/>
           <w:lang w:val="en-US"/>
         </w:rPr>
         <w:t>{/skills}</w:t>
+      </w:r>
+      <w:r>
+        <w:rPr>
+          <w:rFonts w:hint="default" w:asciiTheme="minorAscii" w:hAnsiTheme="minorAscii"/>
+          <w:sz w:val="20"/>
+          <w:lang w:val="en-US"/>
+        </w:rPr>
+        <w:br w:type="column"/>
       </w:r>
     </w:p>
     <w:p>
@@ -1010,45 +1047,14 @@
         <w:jc w:val="both"/>
         <w:textAlignment w:val="auto"/>
         <w:rPr>
-          <w:sz w:val="20"/>
-        </w:rPr>
-      </w:pPr>
-    </w:p>
-    <w:p>
-      <w:pPr>
-        <w:keepNext w:val="0"/>
-        <w:keepLines w:val="0"/>
-        <w:pageBreakBefore w:val="0"/>
-        <w:widowControl/>
-        <w:kinsoku/>
-        <w:wordWrap/>
-        <w:overflowPunct/>
-        <w:topLinePunct w:val="0"/>
-        <w:autoSpaceDE/>
-        <w:autoSpaceDN/>
-        <w:bidi w:val="0"/>
-        <w:adjustRightInd/>
-        <w:snapToGrid/>
-        <w:spacing w:line="4" w:lineRule="atLeast"/>
-        <w:jc w:val="both"/>
-        <w:textAlignment w:val="auto"/>
-        <w:rPr>
-          <w:rFonts w:hint="default"/>
-          <w:sz w:val="20"/>
-          <w:lang w:val="en-US"/>
-        </w:rPr>
-      </w:pPr>
-      <w:r>
-        <w:rPr>
-          <w:rFonts w:hint="default"/>
-          <w:sz w:val="20"/>
-          <w:lang w:val="en-US"/>
-        </w:rPr>
-        <w:br w:type="column"/>
-      </w:r>
-      <w:r>
-        <w:rPr>
-          <w:rFonts w:hint="default"/>
+          <w:rFonts w:hint="default" w:asciiTheme="minorAscii" w:hAnsiTheme="minorAscii"/>
+          <w:sz w:val="20"/>
+          <w:lang w:val="en-US"/>
+        </w:rPr>
+      </w:pPr>
+      <w:r>
+        <w:rPr>
+          <w:rFonts w:hint="default" w:asciiTheme="minorAscii" w:hAnsiTheme="minorAscii"/>
           <w:b/>
           <w:bCs/>
           <w:sz w:val="20"/>
@@ -1076,13 +1082,14 @@
         <w:jc w:val="left"/>
         <w:textAlignment w:val="auto"/>
         <w:rPr>
-          <w:rFonts w:hint="default"/>
-          <w:sz w:val="20"/>
-          <w:lang w:val="en-US"/>
-        </w:rPr>
-      </w:pPr>
-      <w:r>
-        <w:rPr>
+          <w:rFonts w:hint="default" w:asciiTheme="minorAscii" w:hAnsiTheme="minorAscii"/>
+          <w:sz w:val="20"/>
+          <w:lang w:val="en-US"/>
+        </w:rPr>
+      </w:pPr>
+      <w:r>
+        <w:rPr>
+          <w:rFonts w:hint="default" w:asciiTheme="minorAscii" w:hAnsiTheme="minorAscii"/>
           <w:sz w:val="20"/>
         </w:rPr>
         <mc:AlternateContent>
@@ -1168,14 +1175,14 @@
         <w:jc w:val="both"/>
         <w:textAlignment w:val="auto"/>
         <w:rPr>
-          <w:rFonts w:hint="default" w:ascii="Amiri" w:hAnsi="Amiri" w:cs="Amiri"/>
-          <w:sz w:val="20"/>
-          <w:lang w:val="en-US"/>
-        </w:rPr>
-      </w:pPr>
-      <w:r>
-        <w:rPr>
-          <w:rFonts w:hint="default"/>
+          <w:rFonts w:hint="default" w:cs="Amiri" w:asciiTheme="minorAscii" w:hAnsiTheme="minorAscii"/>
+          <w:sz w:val="20"/>
+          <w:lang w:val="en-US"/>
+        </w:rPr>
+      </w:pPr>
+      <w:r>
+        <w:rPr>
+          <w:rFonts w:hint="default" w:asciiTheme="minorAscii" w:hAnsiTheme="minorAscii"/>
           <w:sz w:val="20"/>
           <w:lang w:val="en-US"/>
         </w:rPr>
@@ -1183,7 +1190,7 @@
       </w:r>
       <w:r>
         <w:rPr>
-          <w:rFonts w:hint="default" w:ascii="Amiri" w:hAnsi="Amiri" w:cs="Amiri"/>
+          <w:rFonts w:hint="default" w:cs="Amiri" w:asciiTheme="minorAscii" w:hAnsiTheme="minorAscii"/>
           <w:sz w:val="20"/>
           <w:lang w:val="en-US"/>
         </w:rPr>
@@ -1209,7 +1216,7 @@
         <w:jc w:val="both"/>
         <w:textAlignment w:val="auto"/>
         <w:rPr>
-          <w:rFonts w:hint="default" w:ascii="Amiri" w:hAnsi="Amiri" w:cs="Amiri"/>
+          <w:rFonts w:hint="default" w:cs="Amiri" w:asciiTheme="minorAscii" w:hAnsiTheme="minorAscii"/>
           <w:sz w:val="20"/>
           <w:lang w:val="en-US"/>
         </w:rPr>
@@ -1234,7 +1241,7 @@
         <w:jc w:val="both"/>
         <w:textAlignment w:val="auto"/>
         <w:rPr>
-          <w:rFonts w:hint="default" w:ascii="Amiri" w:hAnsi="Amiri" w:cs="Amiri"/>
+          <w:rFonts w:hint="default" w:cs="Amiri" w:asciiTheme="minorAscii" w:hAnsiTheme="minorAscii"/>
           <w:sz w:val="20"/>
           <w:lang w:val="en-US"/>
         </w:rPr>
@@ -1259,7 +1266,7 @@
         <w:jc w:val="left"/>
         <w:textAlignment w:val="auto"/>
         <w:rPr>
-          <w:rFonts w:hint="default"/>
+          <w:rFonts w:hint="default" w:asciiTheme="minorAscii" w:hAnsiTheme="minorAscii"/>
           <w:b/>
           <w:bCs/>
           <w:sz w:val="20"/>
@@ -1268,7 +1275,7 @@
       </w:pPr>
       <w:r>
         <w:rPr>
-          <w:rFonts w:hint="default"/>
+          <w:rFonts w:hint="default" w:asciiTheme="minorAscii" w:hAnsiTheme="minorAscii"/>
           <w:b/>
           <w:bCs/>
           <w:sz w:val="20"/>
@@ -1296,7 +1303,7 @@
         <w:jc w:val="left"/>
         <w:textAlignment w:val="auto"/>
         <w:rPr>
-          <w:rFonts w:hint="default"/>
+          <w:rFonts w:hint="default" w:asciiTheme="minorAscii" w:hAnsiTheme="minorAscii"/>
           <w:color w:val="767171" w:themeColor="background2" w:themeShade="80"/>
           <w:sz w:val="16"/>
           <w:szCs w:val="16"/>
@@ -1305,7 +1312,7 @@
       </w:pPr>
       <w:r>
         <w:rPr>
-          <w:rFonts w:hint="default"/>
+          <w:rFonts w:hint="default" w:asciiTheme="minorAscii" w:hAnsiTheme="minorAscii"/>
           <w:color w:val="767171" w:themeColor="background2" w:themeShade="80"/>
           <w:sz w:val="16"/>
           <w:szCs w:val="16"/>
@@ -1333,13 +1340,14 @@
         <w:jc w:val="left"/>
         <w:textAlignment w:val="auto"/>
         <w:rPr>
-          <w:rFonts w:hint="default"/>
-          <w:sz w:val="20"/>
-          <w:lang w:val="en-US"/>
-        </w:rPr>
-      </w:pPr>
-      <w:r>
-        <w:rPr>
+          <w:rFonts w:hint="default" w:asciiTheme="minorAscii" w:hAnsiTheme="minorAscii"/>
+          <w:sz w:val="20"/>
+          <w:lang w:val="en-US"/>
+        </w:rPr>
+      </w:pPr>
+      <w:r>
+        <w:rPr>
+          <w:rFonts w:hint="default" w:asciiTheme="minorAscii" w:hAnsiTheme="minorAscii"/>
           <w:sz w:val="20"/>
         </w:rPr>
         <mc:AlternateContent>
@@ -1424,13 +1432,14 @@
         <w:jc w:val="left"/>
         <w:textAlignment w:val="auto"/>
         <w:rPr>
-          <w:rFonts w:hint="default"/>
-          <w:sz w:val="20"/>
-          <w:lang w:val="en-US"/>
-        </w:rPr>
-      </w:pPr>
-      <w:r>
-        <w:rPr>
+          <w:rFonts w:hint="default" w:asciiTheme="minorAscii" w:hAnsiTheme="minorAscii"/>
+          <w:sz w:val="20"/>
+          <w:lang w:val="en-US"/>
+        </w:rPr>
+      </w:pPr>
+      <w:r>
+        <w:rPr>
+          <w:rFonts w:hint="default" w:asciiTheme="minorAscii" w:hAnsiTheme="minorAscii"/>
           <w:sz w:val="20"/>
         </w:rPr>
         <mc:AlternateContent>
@@ -1503,14 +1512,14 @@
                               <w:jc w:val="both"/>
                               <w:textAlignment w:val="auto"/>
                               <w:rPr>
-                                <w:rFonts w:hint="default" w:ascii="Amiri" w:hAnsi="Amiri" w:cs="Amiri"/>
+                                <w:rFonts w:hint="default" w:cs="Amiri" w:asciiTheme="minorAscii" w:hAnsiTheme="minorAscii"/>
                                 <w:sz w:val="20"/>
                                 <w:lang w:val="en-US"/>
                               </w:rPr>
                             </w:pPr>
                             <w:r>
                               <w:rPr>
-                                <w:rFonts w:hint="default" w:ascii="Amiri" w:hAnsi="Amiri" w:cs="Amiri"/>
+                                <w:rFonts w:hint="default" w:cs="Amiri" w:asciiTheme="minorAscii" w:hAnsiTheme="minorAscii"/>
                                 <w:sz w:val="20"/>
                                 <w:lang w:val="en-US"/>
                               </w:rPr>
@@ -1537,7 +1546,7 @@
                               <w:jc w:val="both"/>
                               <w:textAlignment w:val="auto"/>
                               <w:rPr>
-                                <w:rFonts w:hint="default" w:ascii="Amiri" w:hAnsi="Amiri" w:cs="Amiri"/>
+                                <w:rFonts w:hint="default" w:cs="Amiri" w:asciiTheme="minorAscii" w:hAnsiTheme="minorAscii"/>
                                 <w:b/>
                                 <w:bCs/>
                                 <w:sz w:val="20"/>
@@ -1546,7 +1555,7 @@
                             </w:pPr>
                             <w:r>
                               <w:rPr>
-                                <w:rFonts w:hint="default" w:ascii="Amiri" w:hAnsi="Amiri" w:cs="Amiri"/>
+                                <w:rFonts w:hint="default" w:cs="Amiri" w:asciiTheme="minorAscii" w:hAnsiTheme="minorAscii"/>
                                 <w:b/>
                                 <w:bCs/>
                                 <w:sz w:val="20"/>
@@ -1575,14 +1584,14 @@
                               <w:jc w:val="both"/>
                               <w:textAlignment w:val="auto"/>
                               <w:rPr>
-                                <w:rFonts w:hint="default" w:ascii="Amiri" w:hAnsi="Amiri" w:cs="Amiri"/>
+                                <w:rFonts w:hint="default" w:cs="Amiri" w:asciiTheme="minorAscii" w:hAnsiTheme="minorAscii"/>
                                 <w:sz w:val="20"/>
                                 <w:lang w:val="en-US"/>
                               </w:rPr>
                             </w:pPr>
                             <w:r>
                               <w:rPr>
-                                <w:rFonts w:hint="default" w:ascii="Amiri" w:hAnsi="Amiri" w:cs="Amiri"/>
+                                <w:rFonts w:hint="default" w:cs="Amiri" w:asciiTheme="minorAscii" w:hAnsiTheme="minorAscii"/>
                                 <w:sz w:val="20"/>
                                 <w:lang w:val="en-US"/>
                               </w:rPr>
@@ -1590,7 +1599,7 @@
                             </w:r>
                             <w:r>
                               <w:rPr>
-                                <w:rFonts w:hint="default" w:ascii="Amiri" w:hAnsi="Amiri" w:cs="Amiri"/>
+                                <w:rFonts w:hint="default" w:cs="Amiri" w:asciiTheme="minorAscii" w:hAnsiTheme="minorAscii"/>
                                 <w:sz w:val="20"/>
                                 <w:lang w:val="en-US" w:eastAsia="zh-CN"/>
                               </w:rPr>
@@ -1598,7 +1607,7 @@
                             </w:r>
                             <w:r>
                               <w:rPr>
-                                <w:rFonts w:hint="default" w:ascii="Amiri" w:hAnsi="Amiri" w:cs="Amiri"/>
+                                <w:rFonts w:hint="default" w:cs="Amiri" w:asciiTheme="minorAscii" w:hAnsiTheme="minorAscii"/>
                                 <w:sz w:val="20"/>
                                 <w:lang w:val="en-US"/>
                               </w:rPr>
@@ -1625,16 +1634,21 @@
                               <w:jc w:val="both"/>
                               <w:textAlignment w:val="auto"/>
                               <w:rPr>
-                                <w:rFonts w:hint="default" w:ascii="Amiri" w:hAnsi="Amiri" w:cs="Amiri"/>
+                                <w:rFonts w:hint="default" w:cs="Amiri" w:asciiTheme="minorAscii" w:hAnsiTheme="minorAscii"/>
                                 <w:sz w:val="20"/>
                                 <w:lang w:val="en-US"/>
                               </w:rPr>
                             </w:pPr>
                           </w:p>
                           <w:p>
+                            <w:pPr>
+                              <w:rPr>
+                                <w:rFonts w:hint="default" w:asciiTheme="minorAscii" w:hAnsiTheme="minorAscii"/>
+                              </w:rPr>
+                            </w:pPr>
                             <w:r>
                               <w:rPr>
-                                <w:rFonts w:hint="default" w:ascii="Amiri" w:hAnsi="Amiri" w:cs="Amiri"/>
+                                <w:rFonts w:hint="default" w:cs="Amiri" w:asciiTheme="minorAscii" w:hAnsiTheme="minorAscii"/>
                                 <w:sz w:val="20"/>
                                 <w:lang w:val="en-US"/>
                               </w:rPr>
@@ -1680,14 +1694,14 @@
                         <w:jc w:val="both"/>
                         <w:textAlignment w:val="auto"/>
                         <w:rPr>
-                          <w:rFonts w:hint="default" w:ascii="Amiri" w:hAnsi="Amiri" w:cs="Amiri"/>
+                          <w:rFonts w:hint="default" w:cs="Amiri" w:asciiTheme="minorAscii" w:hAnsiTheme="minorAscii"/>
                           <w:sz w:val="20"/>
                           <w:lang w:val="en-US"/>
                         </w:rPr>
                       </w:pPr>
                       <w:r>
                         <w:rPr>
-                          <w:rFonts w:hint="default" w:ascii="Amiri" w:hAnsi="Amiri" w:cs="Amiri"/>
+                          <w:rFonts w:hint="default" w:cs="Amiri" w:asciiTheme="minorAscii" w:hAnsiTheme="minorAscii"/>
                           <w:sz w:val="20"/>
                           <w:lang w:val="en-US"/>
                         </w:rPr>
@@ -1714,7 +1728,7 @@
                         <w:jc w:val="both"/>
                         <w:textAlignment w:val="auto"/>
                         <w:rPr>
-                          <w:rFonts w:hint="default" w:ascii="Amiri" w:hAnsi="Amiri" w:cs="Amiri"/>
+                          <w:rFonts w:hint="default" w:cs="Amiri" w:asciiTheme="minorAscii" w:hAnsiTheme="minorAscii"/>
                           <w:b/>
                           <w:bCs/>
                           <w:sz w:val="20"/>
@@ -1723,7 +1737,7 @@
                       </w:pPr>
                       <w:r>
                         <w:rPr>
-                          <w:rFonts w:hint="default" w:ascii="Amiri" w:hAnsi="Amiri" w:cs="Amiri"/>
+                          <w:rFonts w:hint="default" w:cs="Amiri" w:asciiTheme="minorAscii" w:hAnsiTheme="minorAscii"/>
                           <w:b/>
                           <w:bCs/>
                           <w:sz w:val="20"/>
@@ -1752,14 +1766,14 @@
                         <w:jc w:val="both"/>
                         <w:textAlignment w:val="auto"/>
                         <w:rPr>
-                          <w:rFonts w:hint="default" w:ascii="Amiri" w:hAnsi="Amiri" w:cs="Amiri"/>
+                          <w:rFonts w:hint="default" w:cs="Amiri" w:asciiTheme="minorAscii" w:hAnsiTheme="minorAscii"/>
                           <w:sz w:val="20"/>
                           <w:lang w:val="en-US"/>
                         </w:rPr>
                       </w:pPr>
                       <w:r>
                         <w:rPr>
-                          <w:rFonts w:hint="default" w:ascii="Amiri" w:hAnsi="Amiri" w:cs="Amiri"/>
+                          <w:rFonts w:hint="default" w:cs="Amiri" w:asciiTheme="minorAscii" w:hAnsiTheme="minorAscii"/>
                           <w:sz w:val="20"/>
                           <w:lang w:val="en-US"/>
                         </w:rPr>
@@ -1767,7 +1781,7 @@
                       </w:r>
                       <w:r>
                         <w:rPr>
-                          <w:rFonts w:hint="default" w:ascii="Amiri" w:hAnsi="Amiri" w:cs="Amiri"/>
+                          <w:rFonts w:hint="default" w:cs="Amiri" w:asciiTheme="minorAscii" w:hAnsiTheme="minorAscii"/>
                           <w:sz w:val="20"/>
                           <w:lang w:val="en-US" w:eastAsia="zh-CN"/>
                         </w:rPr>
@@ -1775,7 +1789,7 @@
                       </w:r>
                       <w:r>
                         <w:rPr>
-                          <w:rFonts w:hint="default" w:ascii="Amiri" w:hAnsi="Amiri" w:cs="Amiri"/>
+                          <w:rFonts w:hint="default" w:cs="Amiri" w:asciiTheme="minorAscii" w:hAnsiTheme="minorAscii"/>
                           <w:sz w:val="20"/>
                           <w:lang w:val="en-US"/>
                         </w:rPr>
@@ -1802,16 +1816,21 @@
                         <w:jc w:val="both"/>
                         <w:textAlignment w:val="auto"/>
                         <w:rPr>
-                          <w:rFonts w:hint="default" w:ascii="Amiri" w:hAnsi="Amiri" w:cs="Amiri"/>
+                          <w:rFonts w:hint="default" w:cs="Amiri" w:asciiTheme="minorAscii" w:hAnsiTheme="minorAscii"/>
                           <w:sz w:val="20"/>
                           <w:lang w:val="en-US"/>
                         </w:rPr>
                       </w:pPr>
                     </w:p>
                     <w:p>
+                      <w:pPr>
+                        <w:rPr>
+                          <w:rFonts w:hint="default" w:asciiTheme="minorAscii" w:hAnsiTheme="minorAscii"/>
+                        </w:rPr>
+                      </w:pPr>
                       <w:r>
                         <w:rPr>
-                          <w:rFonts w:hint="default" w:ascii="Amiri" w:hAnsi="Amiri" w:cs="Amiri"/>
+                          <w:rFonts w:hint="default" w:cs="Amiri" w:asciiTheme="minorAscii" w:hAnsiTheme="minorAscii"/>
                           <w:sz w:val="20"/>
                           <w:lang w:val="en-US"/>
                         </w:rPr>
@@ -1828,6 +1847,7 @@
       </w:r>
       <w:r>
         <w:rPr>
+          <w:rFonts w:hint="default" w:asciiTheme="minorAscii" w:hAnsiTheme="minorAscii"/>
           <w:sz w:val="20"/>
         </w:rPr>
         <mc:AlternateContent>
@@ -1900,14 +1920,14 @@
                               <w:jc w:val="both"/>
                               <w:textAlignment w:val="auto"/>
                               <w:rPr>
-                                <w:rFonts w:hint="default" w:ascii="Amiri" w:hAnsi="Amiri" w:cs="Amiri"/>
+                                <w:rFonts w:hint="default" w:cs="Amiri" w:asciiTheme="minorAscii" w:hAnsiTheme="minorAscii"/>
                                 <w:sz w:val="20"/>
                                 <w:lang w:val="en-US"/>
                               </w:rPr>
                             </w:pPr>
                             <w:r>
                               <w:rPr>
-                                <w:rFonts w:hint="default" w:ascii="Amiri" w:hAnsi="Amiri" w:cs="Amiri"/>
+                                <w:rFonts w:hint="default" w:cs="Amiri" w:asciiTheme="minorAscii" w:hAnsiTheme="minorAscii"/>
                                 <w:sz w:val="20"/>
                                 <w:lang w:val="en-US"/>
                               </w:rPr>
@@ -1934,7 +1954,7 @@
                               <w:jc w:val="both"/>
                               <w:textAlignment w:val="auto"/>
                               <w:rPr>
-                                <w:rFonts w:hint="default" w:ascii="Amiri" w:hAnsi="Amiri" w:cs="Amiri"/>
+                                <w:rFonts w:hint="default" w:cs="Amiri" w:asciiTheme="minorAscii" w:hAnsiTheme="minorAscii"/>
                                 <w:b/>
                                 <w:bCs/>
                                 <w:sz w:val="20"/>
@@ -1943,7 +1963,7 @@
                             </w:pPr>
                             <w:r>
                               <w:rPr>
-                                <w:rFonts w:hint="default" w:ascii="Amiri" w:hAnsi="Amiri" w:cs="Amiri"/>
+                                <w:rFonts w:hint="default" w:cs="Amiri" w:asciiTheme="minorAscii" w:hAnsiTheme="minorAscii"/>
                                 <w:b/>
                                 <w:bCs/>
                                 <w:sz w:val="20"/>
@@ -1972,14 +1992,14 @@
                               <w:jc w:val="both"/>
                               <w:textAlignment w:val="auto"/>
                               <w:rPr>
-                                <w:rFonts w:hint="default" w:ascii="Amiri" w:hAnsi="Amiri" w:cs="Amiri"/>
+                                <w:rFonts w:hint="default" w:cs="Amiri" w:asciiTheme="minorAscii" w:hAnsiTheme="minorAscii"/>
                                 <w:sz w:val="20"/>
                                 <w:lang w:val="en-US"/>
                               </w:rPr>
                             </w:pPr>
                             <w:r>
                               <w:rPr>
-                                <w:rFonts w:hint="default" w:ascii="Amiri" w:hAnsi="Amiri" w:cs="Amiri"/>
+                                <w:rFonts w:hint="default" w:cs="Amiri" w:asciiTheme="minorAscii" w:hAnsiTheme="minorAscii"/>
                                 <w:sz w:val="20"/>
                                 <w:lang w:val="en-US"/>
                               </w:rPr>
@@ -1987,7 +2007,7 @@
                             </w:r>
                             <w:r>
                               <w:rPr>
-                                <w:rFonts w:hint="default" w:ascii="Amiri" w:hAnsi="Amiri" w:cs="Amiri"/>
+                                <w:rFonts w:hint="default" w:cs="Amiri" w:asciiTheme="minorAscii" w:hAnsiTheme="minorAscii"/>
                                 <w:sz w:val="20"/>
                                 <w:lang w:val="en-US" w:eastAsia="zh-CN"/>
                               </w:rPr>
@@ -1995,7 +2015,7 @@
                             </w:r>
                             <w:r>
                               <w:rPr>
-                                <w:rFonts w:hint="default" w:ascii="Amiri" w:hAnsi="Amiri" w:cs="Amiri"/>
+                                <w:rFonts w:hint="default" w:cs="Amiri" w:asciiTheme="minorAscii" w:hAnsiTheme="minorAscii"/>
                                 <w:sz w:val="20"/>
                                 <w:lang w:val="en-US"/>
                               </w:rPr>
@@ -2022,16 +2042,21 @@
                               <w:jc w:val="both"/>
                               <w:textAlignment w:val="auto"/>
                               <w:rPr>
-                                <w:rFonts w:hint="default" w:ascii="Amiri" w:hAnsi="Amiri" w:cs="Amiri"/>
+                                <w:rFonts w:hint="default" w:cs="Amiri" w:asciiTheme="minorAscii" w:hAnsiTheme="minorAscii"/>
                                 <w:sz w:val="20"/>
                                 <w:lang w:val="en-US"/>
                               </w:rPr>
                             </w:pPr>
                           </w:p>
                           <w:p>
+                            <w:pPr>
+                              <w:rPr>
+                                <w:rFonts w:hint="default" w:asciiTheme="minorAscii" w:hAnsiTheme="minorAscii"/>
+                              </w:rPr>
+                            </w:pPr>
                             <w:r>
                               <w:rPr>
-                                <w:rFonts w:hint="default" w:ascii="Amiri" w:hAnsi="Amiri" w:cs="Amiri"/>
+                                <w:rFonts w:hint="default" w:cs="Amiri" w:asciiTheme="minorAscii" w:hAnsiTheme="minorAscii"/>
                                 <w:sz w:val="20"/>
                                 <w:lang w:val="en-US"/>
                               </w:rPr>
@@ -2077,14 +2102,14 @@
                         <w:jc w:val="both"/>
                         <w:textAlignment w:val="auto"/>
                         <w:rPr>
-                          <w:rFonts w:hint="default" w:ascii="Amiri" w:hAnsi="Amiri" w:cs="Amiri"/>
+                          <w:rFonts w:hint="default" w:cs="Amiri" w:asciiTheme="minorAscii" w:hAnsiTheme="minorAscii"/>
                           <w:sz w:val="20"/>
                           <w:lang w:val="en-US"/>
                         </w:rPr>
                       </w:pPr>
                       <w:r>
                         <w:rPr>
-                          <w:rFonts w:hint="default" w:ascii="Amiri" w:hAnsi="Amiri" w:cs="Amiri"/>
+                          <w:rFonts w:hint="default" w:cs="Amiri" w:asciiTheme="minorAscii" w:hAnsiTheme="minorAscii"/>
                           <w:sz w:val="20"/>
                           <w:lang w:val="en-US"/>
                         </w:rPr>
@@ -2111,7 +2136,7 @@
                         <w:jc w:val="both"/>
                         <w:textAlignment w:val="auto"/>
                         <w:rPr>
-                          <w:rFonts w:hint="default" w:ascii="Amiri" w:hAnsi="Amiri" w:cs="Amiri"/>
+                          <w:rFonts w:hint="default" w:cs="Amiri" w:asciiTheme="minorAscii" w:hAnsiTheme="minorAscii"/>
                           <w:b/>
                           <w:bCs/>
                           <w:sz w:val="20"/>
@@ -2120,7 +2145,7 @@
                       </w:pPr>
                       <w:r>
                         <w:rPr>
-                          <w:rFonts w:hint="default" w:ascii="Amiri" w:hAnsi="Amiri" w:cs="Amiri"/>
+                          <w:rFonts w:hint="default" w:cs="Amiri" w:asciiTheme="minorAscii" w:hAnsiTheme="minorAscii"/>
                           <w:b/>
                           <w:bCs/>
                           <w:sz w:val="20"/>
@@ -2149,14 +2174,14 @@
                         <w:jc w:val="both"/>
                         <w:textAlignment w:val="auto"/>
                         <w:rPr>
-                          <w:rFonts w:hint="default" w:ascii="Amiri" w:hAnsi="Amiri" w:cs="Amiri"/>
+                          <w:rFonts w:hint="default" w:cs="Amiri" w:asciiTheme="minorAscii" w:hAnsiTheme="minorAscii"/>
                           <w:sz w:val="20"/>
                           <w:lang w:val="en-US"/>
                         </w:rPr>
                       </w:pPr>
                       <w:r>
                         <w:rPr>
-                          <w:rFonts w:hint="default" w:ascii="Amiri" w:hAnsi="Amiri" w:cs="Amiri"/>
+                          <w:rFonts w:hint="default" w:cs="Amiri" w:asciiTheme="minorAscii" w:hAnsiTheme="minorAscii"/>
                           <w:sz w:val="20"/>
                           <w:lang w:val="en-US"/>
                         </w:rPr>
@@ -2164,7 +2189,7 @@
                       </w:r>
                       <w:r>
                         <w:rPr>
-                          <w:rFonts w:hint="default" w:ascii="Amiri" w:hAnsi="Amiri" w:cs="Amiri"/>
+                          <w:rFonts w:hint="default" w:cs="Amiri" w:asciiTheme="minorAscii" w:hAnsiTheme="minorAscii"/>
                           <w:sz w:val="20"/>
                           <w:lang w:val="en-US" w:eastAsia="zh-CN"/>
                         </w:rPr>
@@ -2172,7 +2197,7 @@
                       </w:r>
                       <w:r>
                         <w:rPr>
-                          <w:rFonts w:hint="default" w:ascii="Amiri" w:hAnsi="Amiri" w:cs="Amiri"/>
+                          <w:rFonts w:hint="default" w:cs="Amiri" w:asciiTheme="minorAscii" w:hAnsiTheme="minorAscii"/>
                           <w:sz w:val="20"/>
                           <w:lang w:val="en-US"/>
                         </w:rPr>
@@ -2199,16 +2224,21 @@
                         <w:jc w:val="both"/>
                         <w:textAlignment w:val="auto"/>
                         <w:rPr>
-                          <w:rFonts w:hint="default" w:ascii="Amiri" w:hAnsi="Amiri" w:cs="Amiri"/>
+                          <w:rFonts w:hint="default" w:cs="Amiri" w:asciiTheme="minorAscii" w:hAnsiTheme="minorAscii"/>
                           <w:sz w:val="20"/>
                           <w:lang w:val="en-US"/>
                         </w:rPr>
                       </w:pPr>
                     </w:p>
                     <w:p>
+                      <w:pPr>
+                        <w:rPr>
+                          <w:rFonts w:hint="default" w:asciiTheme="minorAscii" w:hAnsiTheme="minorAscii"/>
+                        </w:rPr>
+                      </w:pPr>
                       <w:r>
                         <w:rPr>
-                          <w:rFonts w:hint="default" w:ascii="Amiri" w:hAnsi="Amiri" w:cs="Amiri"/>
+                          <w:rFonts w:hint="default" w:cs="Amiri" w:asciiTheme="minorAscii" w:hAnsiTheme="minorAscii"/>
                           <w:sz w:val="20"/>
                           <w:lang w:val="en-US"/>
                         </w:rPr>
@@ -2243,7 +2273,7 @@
         <w:jc w:val="left"/>
         <w:textAlignment w:val="auto"/>
         <w:rPr>
-          <w:rFonts w:hint="default"/>
+          <w:rFonts w:hint="default" w:asciiTheme="minorAscii" w:hAnsiTheme="minorAscii"/>
           <w:b/>
           <w:bCs/>
           <w:sz w:val="20"/>
@@ -2252,7 +2282,7 @@
       </w:pPr>
       <w:r>
         <w:rPr>
-          <w:rFonts w:hint="default"/>
+          <w:rFonts w:hint="default" w:asciiTheme="minorAscii" w:hAnsiTheme="minorAscii"/>
           <w:b/>
           <w:bCs/>
           <w:sz w:val="20"/>
@@ -2280,13 +2310,14 @@
         <w:jc w:val="left"/>
         <w:textAlignment w:val="auto"/>
         <w:rPr>
-          <w:rFonts w:hint="default"/>
-          <w:sz w:val="20"/>
-          <w:lang w:val="en-US"/>
-        </w:rPr>
-      </w:pPr>
-      <w:r>
-        <w:rPr>
+          <w:rFonts w:hint="default" w:asciiTheme="minorAscii" w:hAnsiTheme="minorAscii"/>
+          <w:sz w:val="20"/>
+          <w:lang w:val="en-US"/>
+        </w:rPr>
+      </w:pPr>
+      <w:r>
+        <w:rPr>
+          <w:rFonts w:hint="default" w:asciiTheme="minorAscii" w:hAnsiTheme="minorAscii"/>
           <w:sz w:val="20"/>
         </w:rPr>
         <mc:AlternateContent>
@@ -2371,14 +2402,14 @@
         <w:jc w:val="both"/>
         <w:textAlignment w:val="auto"/>
         <w:rPr>
-          <w:rFonts w:hint="default"/>
-          <w:sz w:val="20"/>
-          <w:lang w:val="en-US"/>
-        </w:rPr>
-      </w:pPr>
-      <w:r>
-        <w:rPr>
-          <w:rFonts w:hint="default"/>
+          <w:rFonts w:hint="default" w:asciiTheme="minorAscii" w:hAnsiTheme="minorAscii"/>
+          <w:sz w:val="20"/>
+          <w:lang w:val="en-US"/>
+        </w:rPr>
+      </w:pPr>
+      <w:r>
+        <w:rPr>
+          <w:rFonts w:hint="default" w:asciiTheme="minorAscii" w:hAnsiTheme="minorAscii"/>
           <w:sz w:val="20"/>
           <w:lang w:val="en-US"/>
         </w:rPr>
@@ -2404,7 +2435,7 @@
         <w:jc w:val="both"/>
         <w:textAlignment w:val="auto"/>
         <w:rPr>
-          <w:rFonts w:hint="default" w:ascii="Berenis ADF Pro" w:hAnsi="Berenis ADF Pro" w:cs="Berenis ADF Pro"/>
+          <w:rFonts w:hint="default" w:cs="Berenis ADF Pro" w:asciiTheme="minorAscii" w:hAnsiTheme="minorAscii"/>
           <w:b/>
           <w:bCs/>
           <w:sz w:val="20"/>
@@ -2413,7 +2444,7 @@
       </w:pPr>
       <w:r>
         <w:rPr>
-          <w:rFonts w:hint="default" w:ascii="Berenis ADF Pro" w:hAnsi="Berenis ADF Pro" w:cs="Berenis ADF Pro"/>
+          <w:rFonts w:hint="default" w:cs="Berenis ADF Pro" w:asciiTheme="minorAscii" w:hAnsiTheme="minorAscii"/>
           <w:b/>
           <w:bCs/>
           <w:sz w:val="20"/>
@@ -2441,7 +2472,7 @@
         <w:jc w:val="both"/>
         <w:textAlignment w:val="auto"/>
         <w:rPr>
-          <w:rFonts w:hint="default" w:ascii="EB Garamond SC 12" w:hAnsi="EB Garamond SC 12" w:cs="EB Garamond SC 12"/>
+          <w:rFonts w:hint="default" w:cs="EB Garamond SC 12" w:asciiTheme="minorAscii" w:hAnsiTheme="minorAscii"/>
           <w:b/>
           <w:bCs/>
           <w:sz w:val="20"/>
@@ -2450,7 +2481,7 @@
       </w:pPr>
       <w:r>
         <w:rPr>
-          <w:rFonts w:hint="default" w:ascii="EB Garamond SC 12" w:hAnsi="EB Garamond SC 12" w:cs="EB Garamond SC 12"/>
+          <w:rFonts w:hint="default" w:cs="EB Garamond SC 12" w:asciiTheme="minorAscii" w:hAnsiTheme="minorAscii"/>
           <w:b/>
           <w:bCs/>
           <w:sz w:val="20"/>
@@ -2478,7 +2509,7 @@
         <w:jc w:val="both"/>
         <w:textAlignment w:val="auto"/>
         <w:rPr>
-          <w:rFonts w:hint="default" w:ascii="EB Garamond SC 12" w:hAnsi="EB Garamond SC 12" w:cs="EB Garamond SC 12"/>
+          <w:rFonts w:hint="default" w:cs="EB Garamond SC 12" w:asciiTheme="minorAscii" w:hAnsiTheme="minorAscii"/>
           <w:b w:val="0"/>
           <w:bCs w:val="0"/>
           <w:sz w:val="20"/>
@@ -2487,7 +2518,7 @@
       </w:pPr>
       <w:r>
         <w:rPr>
-          <w:rFonts w:hint="default" w:ascii="EB Garamond SC 12" w:hAnsi="EB Garamond SC 12" w:cs="EB Garamond SC 12"/>
+          <w:rFonts w:hint="default" w:cs="EB Garamond SC 12" w:asciiTheme="minorAscii" w:hAnsiTheme="minorAscii"/>
           <w:b w:val="0"/>
           <w:bCs w:val="0"/>
           <w:sz w:val="20"/>
@@ -2515,7 +2546,7 @@
         <w:jc w:val="both"/>
         <w:textAlignment w:val="auto"/>
         <w:rPr>
-          <w:rFonts w:hint="default" w:ascii="EB Garamond SC 12" w:hAnsi="EB Garamond SC 12" w:cs="EB Garamond SC 12"/>
+          <w:rFonts w:hint="default" w:cs="EB Garamond SC 12" w:asciiTheme="minorAscii" w:hAnsiTheme="minorAscii"/>
           <w:b w:val="0"/>
           <w:bCs w:val="0"/>
           <w:sz w:val="20"/>
@@ -2524,7 +2555,7 @@
       </w:pPr>
       <w:r>
         <w:rPr>
-          <w:rFonts w:hint="default" w:ascii="EB Garamond SC 12" w:hAnsi="EB Garamond SC 12" w:cs="EB Garamond SC 12"/>
+          <w:rFonts w:hint="default" w:cs="EB Garamond SC 12" w:asciiTheme="minorAscii" w:hAnsiTheme="minorAscii"/>
           <w:b w:val="0"/>
           <w:bCs w:val="0"/>
           <w:sz w:val="20"/>
@@ -2552,14 +2583,14 @@
         <w:jc w:val="both"/>
         <w:textAlignment w:val="auto"/>
         <w:rPr>
-          <w:rFonts w:hint="default"/>
-          <w:sz w:val="20"/>
-          <w:lang w:val="en-US"/>
-        </w:rPr>
-      </w:pPr>
-      <w:r>
-        <w:rPr>
-          <w:rFonts w:hint="default"/>
+          <w:rFonts w:hint="default" w:asciiTheme="minorAscii" w:hAnsiTheme="minorAscii"/>
+          <w:sz w:val="20"/>
+          <w:lang w:val="en-US"/>
+        </w:rPr>
+      </w:pPr>
+      <w:r>
+        <w:rPr>
+          <w:rFonts w:hint="default" w:asciiTheme="minorAscii" w:hAnsiTheme="minorAscii"/>
           <w:sz w:val="20"/>
           <w:lang w:val="en-US"/>
         </w:rPr>
@@ -2569,14 +2600,33 @@
     <w:p>
       <w:pPr>
         <w:rPr>
-          <w:rFonts w:hint="default"/>
-          <w:sz w:val="20"/>
-          <w:lang w:val="en-US"/>
-        </w:rPr>
-      </w:pPr>
-      <w:r>
-        <w:rPr>
-          <w:rFonts w:hint="default"/>
+          <w:rFonts w:hint="default" w:asciiTheme="minorAscii" w:hAnsiTheme="minorAscii"/>
+          <w:sz w:val="20"/>
+          <w:lang w:val="en-US"/>
+        </w:rPr>
+      </w:pPr>
+      <w:r>
+        <w:rPr>
+          <w:rFonts w:hint="default" w:asciiTheme="minorAscii" w:hAnsiTheme="minorAscii"/>
+          <w:sz w:val="20"/>
+          <w:lang w:val="en-US"/>
+        </w:rPr>
+        <w:br w:type="page"/>
+      </w:r>
+    </w:p>
+    <w:p>
+      <w:pPr>
+        <w:rPr>
+          <w:rFonts w:hint="default" w:asciiTheme="minorAscii" w:hAnsiTheme="minorAscii"/>
+          <w:sz w:val="20"/>
+          <w:lang w:val="en-US"/>
+        </w:rPr>
+      </w:pPr>
+      <w:bookmarkStart w:id="0" w:name="_GoBack"/>
+      <w:bookmarkEnd w:id="0"/>
+      <w:r>
+        <w:rPr>
+          <w:rFonts w:hint="default" w:asciiTheme="minorAscii" w:hAnsiTheme="minorAscii"/>
           <w:sz w:val="20"/>
           <w:lang w:val="en-US"/>
         </w:rPr>
@@ -2602,7 +2652,7 @@
         <w:jc w:val="both"/>
         <w:textAlignment w:val="auto"/>
         <w:rPr>
-          <w:rFonts w:hint="default"/>
+          <w:rFonts w:hint="default" w:asciiTheme="minorAscii" w:hAnsiTheme="minorAscii"/>
           <w:sz w:val="20"/>
           <w:lang w:val="en-US"/>
         </w:rPr>
@@ -2636,7 +2686,7 @@
         <w:jc w:val="both"/>
         <w:textAlignment w:val="auto"/>
         <w:rPr>
-          <w:rFonts w:hint="default"/>
+          <w:rFonts w:hint="default" w:asciiTheme="minorAscii" w:hAnsiTheme="minorAscii"/>
           <w:sz w:val="20"/>
           <w:lang w:val="en-US"/>
         </w:rPr>
@@ -2661,14 +2711,14 @@
         <w:jc w:val="left"/>
         <w:textAlignment w:val="auto"/>
         <w:rPr>
-          <w:rFonts w:hint="default"/>
-          <w:sz w:val="20"/>
-          <w:lang w:val="en-US"/>
-        </w:rPr>
-      </w:pPr>
-      <w:r>
-        <w:rPr>
-          <w:rFonts w:hint="default"/>
+          <w:rFonts w:hint="default" w:asciiTheme="minorAscii" w:hAnsiTheme="minorAscii"/>
+          <w:sz w:val="20"/>
+          <w:lang w:val="en-US"/>
+        </w:rPr>
+      </w:pPr>
+      <w:r>
+        <w:rPr>
+          <w:rFonts w:hint="default" w:asciiTheme="minorAscii" w:hAnsiTheme="minorAscii"/>
           <w:b/>
           <w:bCs/>
           <w:sz w:val="20"/>
@@ -2676,11 +2726,9 @@
         </w:rPr>
         <w:t>Detailed Professional Career</w:t>
       </w:r>
-      <w:bookmarkStart w:id="0" w:name="_GoBack"/>
-      <w:bookmarkEnd w:id="0"/>
-      <w:r>
-        <w:rPr>
-          <w:rFonts w:hint="default"/>
+      <w:r>
+        <w:rPr>
+          <w:rFonts w:hint="default" w:asciiTheme="minorAscii" w:hAnsiTheme="minorAscii"/>
           <w:sz w:val="20"/>
           <w:lang w:val="en-US"/>
         </w:rPr>
@@ -2706,13 +2754,14 @@
         <w:jc w:val="left"/>
         <w:textAlignment w:val="auto"/>
         <w:rPr>
-          <w:rFonts w:hint="default"/>
-          <w:sz w:val="20"/>
-          <w:lang w:val="en-US"/>
-        </w:rPr>
-      </w:pPr>
-      <w:r>
-        <w:rPr>
+          <w:rFonts w:hint="default" w:asciiTheme="minorAscii" w:hAnsiTheme="minorAscii"/>
+          <w:sz w:val="20"/>
+          <w:lang w:val="en-US"/>
+        </w:rPr>
+      </w:pPr>
+      <w:r>
+        <w:rPr>
+          <w:rFonts w:hint="default" w:asciiTheme="minorAscii" w:hAnsiTheme="minorAscii"/>
           <w:sz w:val="20"/>
         </w:rPr>
         <mc:AlternateContent>
@@ -2797,7 +2846,7 @@
         <w:jc w:val="left"/>
         <w:textAlignment w:val="auto"/>
         <w:rPr>
-          <w:rFonts w:hint="default"/>
+          <w:rFonts w:hint="default" w:asciiTheme="minorAscii" w:hAnsiTheme="minorAscii"/>
           <w:sz w:val="20"/>
           <w:lang w:val="en-US"/>
         </w:rPr>
@@ -2822,14 +2871,14 @@
         <w:jc w:val="both"/>
         <w:textAlignment w:val="auto"/>
         <w:rPr>
-          <w:rFonts w:hint="default" w:ascii="Amiri" w:hAnsi="Amiri" w:cs="Amiri"/>
-          <w:sz w:val="20"/>
-          <w:lang w:val="en-US"/>
-        </w:rPr>
-      </w:pPr>
-      <w:r>
-        <w:rPr>
-          <w:rFonts w:hint="default" w:ascii="Amiri" w:hAnsi="Amiri" w:cs="Amiri"/>
+          <w:rFonts w:hint="default" w:cs="Amiri" w:asciiTheme="minorAscii" w:hAnsiTheme="minorAscii"/>
+          <w:sz w:val="20"/>
+          <w:lang w:val="en-US"/>
+        </w:rPr>
+      </w:pPr>
+      <w:r>
+        <w:rPr>
+          <w:rFonts w:hint="default" w:cs="Amiri" w:asciiTheme="minorAscii" w:hAnsiTheme="minorAscii"/>
           <w:sz w:val="20"/>
           <w:lang w:val="en-US"/>
         </w:rPr>
@@ -2856,7 +2905,7 @@
         <w:jc w:val="both"/>
         <w:textAlignment w:val="auto"/>
         <w:rPr>
-          <w:rFonts w:hint="default" w:ascii="Amiri" w:hAnsi="Amiri" w:cs="Amiri"/>
+          <w:rFonts w:hint="default" w:cs="Amiri" w:asciiTheme="minorAscii" w:hAnsiTheme="minorAscii"/>
           <w:b/>
           <w:bCs/>
           <w:sz w:val="20"/>
@@ -2865,7 +2914,7 @@
       </w:pPr>
       <w:r>
         <w:rPr>
-          <w:rFonts w:hint="default" w:ascii="Amiri" w:hAnsi="Amiri" w:cs="Amiri"/>
+          <w:rFonts w:hint="default" w:cs="Amiri" w:asciiTheme="minorAscii" w:hAnsiTheme="minorAscii"/>
           <w:b/>
           <w:bCs/>
           <w:sz w:val="20"/>
@@ -2894,7 +2943,7 @@
         <w:jc w:val="both"/>
         <w:textAlignment w:val="auto"/>
         <w:rPr>
-          <w:rFonts w:hint="default" w:ascii="Amiri" w:hAnsi="Amiri" w:cs="Amiri"/>
+          <w:rFonts w:hint="default" w:cs="Amiri" w:asciiTheme="minorAscii" w:hAnsiTheme="minorAscii"/>
           <w:b/>
           <w:bCs/>
           <w:sz w:val="20"/>
@@ -2903,7 +2952,7 @@
       </w:pPr>
       <w:r>
         <w:rPr>
-          <w:rFonts w:hint="default" w:ascii="Amiri" w:hAnsi="Amiri" w:cs="Amiri"/>
+          <w:rFonts w:hint="default" w:cs="Amiri" w:asciiTheme="minorAscii" w:hAnsiTheme="minorAscii"/>
           <w:b/>
           <w:bCs/>
           <w:sz w:val="20"/>
@@ -2913,7 +2962,7 @@
       </w:r>
       <w:r>
         <w:rPr>
-          <w:rFonts w:hint="default" w:ascii="Amiri" w:hAnsi="Amiri" w:cs="Amiri"/>
+          <w:rFonts w:hint="default" w:cs="Amiri" w:asciiTheme="minorAscii" w:hAnsiTheme="minorAscii"/>
           <w:b/>
           <w:bCs/>
           <w:sz w:val="20"/>
@@ -2923,7 +2972,7 @@
       </w:r>
       <w:r>
         <w:rPr>
-          <w:rFonts w:hint="default" w:ascii="Amiri" w:hAnsi="Amiri" w:cs="Amiri"/>
+          <w:rFonts w:hint="default" w:cs="Amiri" w:asciiTheme="minorAscii" w:hAnsiTheme="minorAscii"/>
           <w:b/>
           <w:bCs/>
           <w:sz w:val="20"/>
@@ -2952,14 +3001,14 @@
         <w:jc w:val="both"/>
         <w:textAlignment w:val="auto"/>
         <w:rPr>
-          <w:rFonts w:hint="default" w:ascii="Amiri" w:hAnsi="Amiri" w:cs="Amiri"/>
-          <w:sz w:val="20"/>
-          <w:lang w:val="en-US"/>
-        </w:rPr>
-      </w:pPr>
-      <w:r>
-        <w:rPr>
-          <w:rFonts w:hint="default" w:ascii="Amiri" w:hAnsi="Amiri" w:cs="Amiri"/>
+          <w:rFonts w:hint="default" w:cs="Amiri" w:asciiTheme="minorAscii" w:hAnsiTheme="minorAscii"/>
+          <w:sz w:val="20"/>
+          <w:lang w:val="en-US"/>
+        </w:rPr>
+      </w:pPr>
+      <w:r>
+        <w:rPr>
+          <w:rFonts w:hint="default" w:cs="Amiri" w:asciiTheme="minorAscii" w:hAnsiTheme="minorAscii"/>
           <w:sz w:val="20"/>
           <w:lang w:val="en-US"/>
         </w:rPr>
@@ -2986,16 +3035,21 @@
         <w:jc w:val="both"/>
         <w:textAlignment w:val="auto"/>
         <w:rPr>
-          <w:rFonts w:hint="default" w:ascii="Amiri" w:hAnsi="Amiri" w:cs="Amiri"/>
-          <w:sz w:val="20"/>
-          <w:lang w:val="en-US"/>
-        </w:rPr>
-      </w:pPr>
-    </w:p>
-    <w:p>
-      <w:r>
-        <w:rPr>
-          <w:rFonts w:hint="default" w:ascii="Amiri" w:hAnsi="Amiri" w:cs="Amiri"/>
+          <w:rFonts w:hint="default" w:cs="Amiri" w:asciiTheme="minorAscii" w:hAnsiTheme="minorAscii"/>
+          <w:sz w:val="20"/>
+          <w:lang w:val="en-US"/>
+        </w:rPr>
+      </w:pPr>
+    </w:p>
+    <w:p>
+      <w:pPr>
+        <w:rPr>
+          <w:rFonts w:hint="default" w:asciiTheme="minorAscii" w:hAnsiTheme="minorAscii"/>
+        </w:rPr>
+      </w:pPr>
+      <w:r>
+        <w:rPr>
+          <w:rFonts w:hint="default" w:cs="Amiri" w:asciiTheme="minorAscii" w:hAnsiTheme="minorAscii"/>
           <w:sz w:val="20"/>
           <w:lang w:val="en-US"/>
         </w:rPr>
@@ -3021,7 +3075,7 @@
         <w:jc w:val="left"/>
         <w:textAlignment w:val="auto"/>
         <w:rPr>
-          <w:rFonts w:hint="default"/>
+          <w:rFonts w:hint="default" w:asciiTheme="minorAscii" w:hAnsiTheme="minorAscii"/>
           <w:sz w:val="20"/>
           <w:lang w:val="en-US"/>
         </w:rPr>

</xml_diff>

<commit_message>
Fix typo in email
</commit_message>
<xml_diff>
--- a/public/CVTemplateFull.docx
+++ b/public/CVTemplateFull.docx
@@ -431,7 +431,19 @@
           <w:szCs w:val="24"/>
           <w:lang w:val="en-US" w:eastAsia="zh-CN" w:bidi="ar"/>
         </w:rPr>
-        <w:t>walid.khail@gmail.com</w:t>
+        <w:t>walid.khial</w:t>
+      </w:r>
+      <w:bookmarkStart w:id="0" w:name="_GoBack"/>
+      <w:bookmarkEnd w:id="0"/>
+      <w:r>
+        <w:rPr>
+          <w:rFonts w:hint="default" w:eastAsia="SimSun" w:cs="Amiri" w:asciiTheme="minorAscii" w:hAnsiTheme="minorAscii"/>
+          <w:kern w:val="0"/>
+          <w:sz w:val="24"/>
+          <w:szCs w:val="24"/>
+          <w:lang w:val="en-US" w:eastAsia="zh-CN" w:bidi="ar"/>
+        </w:rPr>
+        <w:t>@gmail.com</w:t>
       </w:r>
     </w:p>
     <w:p>
@@ -2621,8 +2633,6 @@
         </w:rPr>
         <w:br w:type="page"/>
       </w:r>
-      <w:bookmarkStart w:id="0" w:name="_GoBack"/>
-      <w:bookmarkEnd w:id="0"/>
     </w:p>
     <w:p>
       <w:pPr>

</xml_diff>